<commit_message>
update manual book untuk admin
</commit_message>
<xml_diff>
--- a/manual_book/admin.docx
+++ b/manual_book/admin.docx
@@ -19,8 +19,6 @@
           <w:docGrid w:linePitch="360"/>
         </w:sectPr>
       </w:pPr>
-      <w:bookmarkStart w:id="0" w:name="_GoBack"/>
-      <w:bookmarkEnd w:id="0"/>
     </w:p>
     <w:p>
       <w:pPr>
@@ -75,6 +73,9 @@
         <w:jc w:val="both"/>
       </w:pPr>
       <w:r>
+        <w:rPr>
+          <w:noProof/>
+        </w:rPr>
         <w:drawing>
           <wp:inline distT="0" distB="0" distL="0" distR="0" wp14:anchorId="78A92C28" wp14:editId="2F63D921">
             <wp:extent cx="5039995" cy="2571750"/>
@@ -145,6 +146,9 @@
         <w:jc w:val="both"/>
       </w:pPr>
       <w:r>
+        <w:rPr>
+          <w:noProof/>
+        </w:rPr>
         <w:drawing>
           <wp:inline distT="0" distB="0" distL="0" distR="0" wp14:anchorId="32AF2B5B" wp14:editId="142F08DD">
             <wp:extent cx="5039995" cy="2581275"/>
@@ -201,6 +205,9 @@
         <w:jc w:val="center"/>
       </w:pPr>
       <w:r>
+        <w:rPr>
+          <w:noProof/>
+        </w:rPr>
         <w:lastRenderedPageBreak/>
         <w:drawing>
           <wp:inline distT="0" distB="0" distL="0" distR="0" wp14:anchorId="7CD44893" wp14:editId="1C0452EB">
@@ -270,6 +277,7 @@
       <w:r>
         <w:rPr>
           <w:b/>
+          <w:noProof/>
           <w:sz w:val="32"/>
         </w:rPr>
         <w:lastRenderedPageBreak/>
@@ -372,6 +380,9 @@
         <w:jc w:val="both"/>
       </w:pPr>
       <w:r>
+        <w:rPr>
+          <w:noProof/>
+        </w:rPr>
         <w:drawing>
           <wp:inline distT="0" distB="0" distL="0" distR="0" wp14:anchorId="5673F384" wp14:editId="6327A060">
             <wp:extent cx="5039995" cy="2581910"/>
@@ -428,6 +439,9 @@
         <w:jc w:val="both"/>
       </w:pPr>
       <w:r>
+        <w:rPr>
+          <w:noProof/>
+        </w:rPr>
         <w:drawing>
           <wp:inline distT="0" distB="0" distL="0" distR="0" wp14:anchorId="0F8BF491" wp14:editId="44A103E0">
             <wp:extent cx="5039995" cy="2606040"/>
@@ -484,6 +498,9 @@
         <w:jc w:val="both"/>
       </w:pPr>
       <w:r>
+        <w:rPr>
+          <w:noProof/>
+        </w:rPr>
         <w:lastRenderedPageBreak/>
         <w:drawing>
           <wp:inline distT="0" distB="0" distL="0" distR="0" wp14:anchorId="4C38D0DA" wp14:editId="041E740B">
@@ -586,6 +603,9 @@
         <w:jc w:val="both"/>
       </w:pPr>
       <w:r>
+        <w:rPr>
+          <w:noProof/>
+        </w:rPr>
         <w:drawing>
           <wp:inline distT="0" distB="0" distL="0" distR="0" wp14:anchorId="6473577D" wp14:editId="071CC79A">
             <wp:extent cx="5039995" cy="2602865"/>
@@ -645,6 +665,9 @@
         <w:jc w:val="both"/>
       </w:pPr>
       <w:r>
+        <w:rPr>
+          <w:noProof/>
+        </w:rPr>
         <w:drawing>
           <wp:inline distT="0" distB="0" distL="0" distR="0" wp14:anchorId="0161FB6D" wp14:editId="76CC02D4">
             <wp:extent cx="5039995" cy="3759200"/>
@@ -693,13 +716,7 @@
         <w:jc w:val="both"/>
       </w:pPr>
       <w:r>
-        <w:t xml:space="preserve">Jika sudah klik simpan petugas untuk menyimpan </w:t>
-      </w:r>
-      <w:r>
-        <w:t>perubahan</w:t>
-      </w:r>
-      <w:r>
-        <w:t>.</w:t>
+        <w:t>Jika sudah klik simpan petugas untuk menyimpan perubahan.</w:t>
       </w:r>
     </w:p>
     <w:p>
@@ -750,6 +767,9 @@
         <w:jc w:val="both"/>
       </w:pPr>
       <w:r>
+        <w:rPr>
+          <w:noProof/>
+        </w:rPr>
         <w:drawing>
           <wp:inline distT="0" distB="0" distL="0" distR="0" wp14:anchorId="3DC277F2" wp14:editId="7D603199">
             <wp:extent cx="5039995" cy="2597150"/>
@@ -857,6 +877,9 @@
         <w:jc w:val="both"/>
       </w:pPr>
       <w:r>
+        <w:rPr>
+          <w:noProof/>
+        </w:rPr>
         <w:drawing>
           <wp:inline distT="0" distB="0" distL="0" distR="0" wp14:anchorId="39875900" wp14:editId="23330656">
             <wp:extent cx="5039995" cy="2594610"/>
@@ -947,6 +970,9 @@
         <w:jc w:val="both"/>
       </w:pPr>
       <w:r>
+        <w:rPr>
+          <w:noProof/>
+        </w:rPr>
         <w:drawing>
           <wp:inline distT="0" distB="0" distL="0" distR="0" wp14:anchorId="679AAF02" wp14:editId="59F12117">
             <wp:extent cx="5039995" cy="2569845"/>
@@ -1001,9 +1027,112 @@
         <w:t>.</w:t>
       </w:r>
     </w:p>
+    <w:p>
+      <w:pPr>
+        <w:jc w:val="center"/>
+        <w:rPr>
+          <w:b/>
+          <w:sz w:val="32"/>
+        </w:rPr>
+      </w:pPr>
+      <w:r>
+        <w:br w:type="page"/>
+      </w:r>
+      <w:r>
+        <w:rPr>
+          <w:b/>
+          <w:sz w:val="32"/>
+        </w:rPr>
+        <w:lastRenderedPageBreak/>
+        <w:t>MENGGANTI NOMOR HANDPHONE UNTUK WHATSAPP</w:t>
+      </w:r>
+    </w:p>
+    <w:p>
+      <w:pPr>
+        <w:jc w:val="center"/>
+        <w:rPr>
+          <w:b/>
+          <w:sz w:val="32"/>
+        </w:rPr>
+      </w:pPr>
+    </w:p>
+    <w:p>
+      <w:pPr>
+        <w:pStyle w:val="ListParagraph"/>
+        <w:numPr>
+          <w:ilvl w:val="0"/>
+          <w:numId w:val="7"/>
+        </w:numPr>
+        <w:ind w:left="284"/>
+        <w:jc w:val="both"/>
+      </w:pPr>
+      <w:r>
+        <w:t>Klik menu Pengaturan Fitur di sidebar</w:t>
+      </w:r>
+      <w:r>
+        <w:t>, ganti nomor menggunakan nomor whatsapp petugas.</w:t>
+      </w:r>
+      <w:r>
+        <w:t xml:space="preserve"> </w:t>
+      </w:r>
+      <w:r>
+        <w:drawing>
+          <wp:inline distT="0" distB="0" distL="0" distR="0" wp14:anchorId="44A76145" wp14:editId="04668F41">
+            <wp:extent cx="5129530" cy="2663190"/>
+            <wp:effectExtent l="0" t="0" r="0" b="3810"/>
+            <wp:docPr id="14" name="Picture 14"/>
+            <wp:cNvGraphicFramePr>
+              <a:graphicFrameLocks xmlns:a="http://schemas.openxmlformats.org/drawingml/2006/main" noChangeAspect="1"/>
+            </wp:cNvGraphicFramePr>
+            <a:graphic xmlns:a="http://schemas.openxmlformats.org/drawingml/2006/main">
+              <a:graphicData uri="http://schemas.openxmlformats.org/drawingml/2006/picture">
+                <pic:pic xmlns:pic="http://schemas.openxmlformats.org/drawingml/2006/picture">
+                  <pic:nvPicPr>
+                    <pic:cNvPr id="1" name=""/>
+                    <pic:cNvPicPr/>
+                  </pic:nvPicPr>
+                  <pic:blipFill>
+                    <a:blip r:embed="rId23"/>
+                    <a:stretch>
+                      <a:fillRect/>
+                    </a:stretch>
+                  </pic:blipFill>
+                  <pic:spPr>
+                    <a:xfrm>
+                      <a:off x="0" y="0"/>
+                      <a:ext cx="5129530" cy="2663190"/>
+                    </a:xfrm>
+                    <a:prstGeom prst="rect">
+                      <a:avLst/>
+                    </a:prstGeom>
+                  </pic:spPr>
+                </pic:pic>
+              </a:graphicData>
+            </a:graphic>
+          </wp:inline>
+        </w:drawing>
+      </w:r>
+    </w:p>
+    <w:p>
+      <w:pPr>
+        <w:pStyle w:val="ListParagraph"/>
+        <w:numPr>
+          <w:ilvl w:val="0"/>
+          <w:numId w:val="7"/>
+        </w:numPr>
+        <w:ind w:left="284" w:hanging="284"/>
+        <w:jc w:val="both"/>
+      </w:pPr>
+      <w:r>
+        <w:t>Pastikan tombol fitur aktif, jika sudah klik tombol Simpan Pengaturan Whatsapp.</w:t>
+      </w:r>
+      <w:bookmarkStart w:id="0" w:name="_GoBack"/>
+      <w:bookmarkEnd w:id="0"/>
+    </w:p>
+    <w:p/>
     <w:sectPr>
       <w:pgSz w:w="11906" w:h="16838" w:code="9"/>
-      <w:pgMar w:top="1701" w:right="1701" w:bottom="1701" w:left="2268" w:header="720" w:footer="720" w:gutter="0"/>
+      <w:pgMar w:top="1701" w:right="1701" w:bottom="1701" w:left="2127" w:header="720" w:footer="720" w:gutter="0"/>
       <w:pgNumType w:start="1"/>
       <w:cols w:space="720"/>
       <w:docGrid w:linePitch="360"/>
@@ -1093,6 +1222,7 @@
               <w:dataBinding w:prefixMappings="xmlns:ns0='http://purl.org/dc/elements/1.1/' xmlns:ns1='http://schemas.openxmlformats.org/package/2006/metadata/core-properties' " w:xpath="/ns1:coreProperties[1]/ns0:title[1]" w:storeItemID="{6C3C8BC8-F283-45AE-878A-BAB7291924A1}"/>
               <w:text/>
             </w:sdtPr>
+            <w:sdtEndPr/>
             <w:sdtContent>
               <w:r>
                 <w:rPr>
@@ -1130,6 +1260,7 @@
             <w:dataBinding w:prefixMappings="xmlns:ns0='http://purl.org/dc/elements/1.1/' xmlns:ns1='http://schemas.openxmlformats.org/package/2006/metadata/core-properties' " w:xpath="/ns1:coreProperties[1]/ns0:creator[1]" w:storeItemID="{6C3C8BC8-F283-45AE-878A-BAB7291924A1}"/>
             <w:text/>
           </w:sdtPr>
+          <w:sdtEndPr/>
           <w:sdtContent>
             <w:p>
               <w:pPr>
@@ -1526,7 +1657,7 @@
                                 <w:sz w:val="24"/>
                                 <w:szCs w:val="24"/>
                               </w:rPr>
-                              <w:t>1</w:t>
+                              <w:t>10</w:t>
                             </w:r>
                             <w:r>
                               <w:rPr>
@@ -1625,7 +1756,7 @@
                           <w:sz w:val="24"/>
                           <w:szCs w:val="24"/>
                         </w:rPr>
-                        <w:t>1</w:t>
+                        <w:t>10</w:t>
                       </w:r>
                       <w:r>
                         <w:rPr>
@@ -1653,6 +1784,95 @@
 <file path=word/numbering.xml><?xml version="1.0" encoding="utf-8"?>
 <w:numbering xmlns:wpc="http://schemas.microsoft.com/office/word/2010/wordprocessingCanvas" xmlns:cx="http://schemas.microsoft.com/office/drawing/2014/chartex" xmlns:mc="http://schemas.openxmlformats.org/markup-compatibility/2006" xmlns:o="urn:schemas-microsoft-com:office:office" xmlns:r="http://schemas.openxmlformats.org/officeDocument/2006/relationships" xmlns:m="http://schemas.openxmlformats.org/officeDocument/2006/math" xmlns:v="urn:schemas-microsoft-com:vml" xmlns:wp14="http://schemas.microsoft.com/office/word/2010/wordprocessingDrawing" xmlns:wp="http://schemas.openxmlformats.org/drawingml/2006/wordprocessingDrawing" xmlns:w10="urn:schemas-microsoft-com:office:word" xmlns:w="http://schemas.openxmlformats.org/wordprocessingml/2006/main" xmlns:w14="http://schemas.microsoft.com/office/word/2010/wordml" xmlns:w15="http://schemas.microsoft.com/office/word/2012/wordml" xmlns:w16se="http://schemas.microsoft.com/office/word/2015/wordml/symex" xmlns:wpg="http://schemas.microsoft.com/office/word/2010/wordprocessingGroup" xmlns:wpi="http://schemas.microsoft.com/office/word/2010/wordprocessingInk" xmlns:wne="http://schemas.microsoft.com/office/word/2006/wordml" xmlns:wps="http://schemas.microsoft.com/office/word/2010/wordprocessingShape" mc:Ignorable="w14 w15 w16se wp14">
   <w:abstractNum w:abstractNumId="0" w15:restartNumberingAfterBreak="0">
+    <w:nsid w:val="020C3780"/>
+    <w:multiLevelType w:val="hybridMultilevel"/>
+    <w:tmpl w:val="82F2DE92"/>
+    <w:lvl w:ilvl="0" w:tplc="0409000F">
+      <w:start w:val="1"/>
+      <w:numFmt w:val="decimal"/>
+      <w:lvlText w:val="%1."/>
+      <w:lvlJc w:val="left"/>
+      <w:pPr>
+        <w:ind w:left="720" w:hanging="360"/>
+      </w:pPr>
+      <w:rPr>
+        <w:rFonts w:hint="default"/>
+      </w:rPr>
+    </w:lvl>
+    <w:lvl w:ilvl="1" w:tplc="04090019" w:tentative="1">
+      <w:start w:val="1"/>
+      <w:numFmt w:val="lowerLetter"/>
+      <w:lvlText w:val="%2."/>
+      <w:lvlJc w:val="left"/>
+      <w:pPr>
+        <w:ind w:left="1440" w:hanging="360"/>
+      </w:pPr>
+    </w:lvl>
+    <w:lvl w:ilvl="2" w:tplc="0409001B" w:tentative="1">
+      <w:start w:val="1"/>
+      <w:numFmt w:val="lowerRoman"/>
+      <w:lvlText w:val="%3."/>
+      <w:lvlJc w:val="right"/>
+      <w:pPr>
+        <w:ind w:left="2160" w:hanging="180"/>
+      </w:pPr>
+    </w:lvl>
+    <w:lvl w:ilvl="3" w:tplc="0409000F" w:tentative="1">
+      <w:start w:val="1"/>
+      <w:numFmt w:val="decimal"/>
+      <w:lvlText w:val="%4."/>
+      <w:lvlJc w:val="left"/>
+      <w:pPr>
+        <w:ind w:left="2880" w:hanging="360"/>
+      </w:pPr>
+    </w:lvl>
+    <w:lvl w:ilvl="4" w:tplc="04090019" w:tentative="1">
+      <w:start w:val="1"/>
+      <w:numFmt w:val="lowerLetter"/>
+      <w:lvlText w:val="%5."/>
+      <w:lvlJc w:val="left"/>
+      <w:pPr>
+        <w:ind w:left="3600" w:hanging="360"/>
+      </w:pPr>
+    </w:lvl>
+    <w:lvl w:ilvl="5" w:tplc="0409001B" w:tentative="1">
+      <w:start w:val="1"/>
+      <w:numFmt w:val="lowerRoman"/>
+      <w:lvlText w:val="%6."/>
+      <w:lvlJc w:val="right"/>
+      <w:pPr>
+        <w:ind w:left="4320" w:hanging="180"/>
+      </w:pPr>
+    </w:lvl>
+    <w:lvl w:ilvl="6" w:tplc="0409000F" w:tentative="1">
+      <w:start w:val="1"/>
+      <w:numFmt w:val="decimal"/>
+      <w:lvlText w:val="%7."/>
+      <w:lvlJc w:val="left"/>
+      <w:pPr>
+        <w:ind w:left="5040" w:hanging="360"/>
+      </w:pPr>
+    </w:lvl>
+    <w:lvl w:ilvl="7" w:tplc="04090019" w:tentative="1">
+      <w:start w:val="1"/>
+      <w:numFmt w:val="lowerLetter"/>
+      <w:lvlText w:val="%8."/>
+      <w:lvlJc w:val="left"/>
+      <w:pPr>
+        <w:ind w:left="5760" w:hanging="360"/>
+      </w:pPr>
+    </w:lvl>
+    <w:lvl w:ilvl="8" w:tplc="0409001B" w:tentative="1">
+      <w:start w:val="1"/>
+      <w:numFmt w:val="lowerRoman"/>
+      <w:lvlText w:val="%9."/>
+      <w:lvlJc w:val="right"/>
+      <w:pPr>
+        <w:ind w:left="6480" w:hanging="180"/>
+      </w:pPr>
+    </w:lvl>
+  </w:abstractNum>
+  <w:abstractNum w:abstractNumId="1" w15:restartNumberingAfterBreak="0">
     <w:nsid w:val="198F3BF1"/>
     <w:multiLevelType w:val="hybridMultilevel"/>
     <w:tmpl w:val="A5B226DA"/>
@@ -1741,7 +1961,7 @@
       </w:pPr>
     </w:lvl>
   </w:abstractNum>
-  <w:abstractNum w:abstractNumId="1" w15:restartNumberingAfterBreak="0">
+  <w:abstractNum w:abstractNumId="2" w15:restartNumberingAfterBreak="0">
     <w:nsid w:val="1B791613"/>
     <w:multiLevelType w:val="hybridMultilevel"/>
     <w:tmpl w:val="ED14CB2C"/>
@@ -1830,7 +2050,7 @@
       </w:pPr>
     </w:lvl>
   </w:abstractNum>
-  <w:abstractNum w:abstractNumId="2" w15:restartNumberingAfterBreak="0">
+  <w:abstractNum w:abstractNumId="3" w15:restartNumberingAfterBreak="0">
     <w:nsid w:val="571C10FB"/>
     <w:multiLevelType w:val="hybridMultilevel"/>
     <w:tmpl w:val="29E0FC10"/>
@@ -1919,7 +2139,7 @@
       </w:pPr>
     </w:lvl>
   </w:abstractNum>
-  <w:abstractNum w:abstractNumId="3" w15:restartNumberingAfterBreak="0">
+  <w:abstractNum w:abstractNumId="4" w15:restartNumberingAfterBreak="0">
     <w:nsid w:val="60B545D9"/>
     <w:multiLevelType w:val="hybridMultilevel"/>
     <w:tmpl w:val="82F2DE92"/>
@@ -2008,7 +2228,7 @@
       </w:pPr>
     </w:lvl>
   </w:abstractNum>
-  <w:abstractNum w:abstractNumId="4" w15:restartNumberingAfterBreak="0">
+  <w:abstractNum w:abstractNumId="5" w15:restartNumberingAfterBreak="0">
     <w:nsid w:val="63B306A7"/>
     <w:multiLevelType w:val="hybridMultilevel"/>
     <w:tmpl w:val="3EE661AC"/>
@@ -2097,7 +2317,7 @@
       </w:pPr>
     </w:lvl>
   </w:abstractNum>
-  <w:abstractNum w:abstractNumId="5" w15:restartNumberingAfterBreak="0">
+  <w:abstractNum w:abstractNumId="6" w15:restartNumberingAfterBreak="0">
     <w:nsid w:val="6A63313A"/>
     <w:multiLevelType w:val="hybridMultilevel"/>
     <w:tmpl w:val="F97A590C"/>
@@ -2187,22 +2407,25 @@
     </w:lvl>
   </w:abstractNum>
   <w:num w:numId="1">
-    <w:abstractNumId w:val="0"/>
+    <w:abstractNumId w:val="1"/>
   </w:num>
   <w:num w:numId="2">
+    <w:abstractNumId w:val="5"/>
+  </w:num>
+  <w:num w:numId="3">
+    <w:abstractNumId w:val="6"/>
+  </w:num>
+  <w:num w:numId="4">
+    <w:abstractNumId w:val="2"/>
+  </w:num>
+  <w:num w:numId="5">
+    <w:abstractNumId w:val="3"/>
+  </w:num>
+  <w:num w:numId="6">
     <w:abstractNumId w:val="4"/>
   </w:num>
-  <w:num w:numId="3">
-    <w:abstractNumId w:val="5"/>
-  </w:num>
-  <w:num w:numId="4">
-    <w:abstractNumId w:val="1"/>
-  </w:num>
-  <w:num w:numId="5">
-    <w:abstractNumId w:val="2"/>
-  </w:num>
-  <w:num w:numId="6">
-    <w:abstractNumId w:val="3"/>
+  <w:num w:numId="7">
+    <w:abstractNumId w:val="0"/>
   </w:num>
 </w:numbering>
 </file>
@@ -2775,21 +2998,21 @@
     <w:charset w:val="00"/>
     <w:family w:val="roman"/>
     <w:pitch w:val="variable"/>
-    <w:sig w:usb0="E0002AFF" w:usb1="C0007843" w:usb2="00000009" w:usb3="00000000" w:csb0="000001FF" w:csb1="00000000"/>
+    <w:sig w:usb0="E0002EFF" w:usb1="C000785B" w:usb2="00000009" w:usb3="00000000" w:csb0="000001FF" w:csb1="00000000"/>
   </w:font>
   <w:font w:name="Calibri">
     <w:panose1 w:val="020F0502020204030204"/>
     <w:charset w:val="00"/>
     <w:family w:val="swiss"/>
     <w:pitch w:val="variable"/>
-    <w:sig w:usb0="E0002AFF" w:usb1="4000ACFF" w:usb2="00000001" w:usb3="00000000" w:csb0="000001FF" w:csb1="00000000"/>
+    <w:sig w:usb0="E4002EFF" w:usb1="C200247B" w:usb2="00000009" w:usb3="00000000" w:csb0="000001FF" w:csb1="00000000"/>
   </w:font>
   <w:font w:name="Calibri Light">
     <w:panose1 w:val="020F0302020204030204"/>
     <w:charset w:val="00"/>
     <w:family w:val="swiss"/>
     <w:pitch w:val="variable"/>
-    <w:sig w:usb0="A0002AEF" w:usb1="4000207B" w:usb2="00000000" w:usb3="00000000" w:csb0="000001FF" w:csb1="00000000"/>
+    <w:sig w:usb0="E4002EFF" w:usb1="C200247B" w:usb2="00000009" w:usb3="00000000" w:csb0="000001FF" w:csb1="00000000"/>
   </w:font>
 </w:fonts>
 </file>
@@ -2812,6 +3035,8 @@
     <w:rsidRoot w:val="002E7B0A"/>
     <w:rsid w:val="002209CE"/>
     <w:rsid w:val="002E7B0A"/>
+    <w:rsid w:val="00704EE8"/>
+    <w:rsid w:val="007A543F"/>
   </w:rsids>
   <m:mathPr>
     <m:mathFont m:val="Cambria Math"/>
@@ -3539,7 +3764,7 @@
 </file>
 
 <file path=customXml/itemProps1.xml><?xml version="1.0" encoding="utf-8"?>
-<ds:datastoreItem xmlns:ds="http://schemas.openxmlformats.org/officeDocument/2006/customXml" ds:itemID="{CC450FAC-12A3-4C01-A0E9-A5F4394AF526}">
+<ds:datastoreItem xmlns:ds="http://schemas.openxmlformats.org/officeDocument/2006/customXml" ds:itemID="{63784C18-B816-4FF4-80D7-819F63DB7BF9}">
   <ds:schemaRefs>
     <ds:schemaRef ds:uri="http://schemas.openxmlformats.org/officeDocument/2006/bibliography"/>
   </ds:schemaRefs>

</xml_diff>